<commit_message>
Add notification sounds and Kanban reminders
</commit_message>
<xml_diff>
--- a/STUDY_PLANNER_DOCUMENTATION.docx
+++ b/STUDY_PLANNER_DOCUMENTATION.docx
@@ -338,7 +338,7 @@
         <w:pStyle w:val="Normal"/>
       </w:pPr>
       <w:r>
-        <w:t xml:space="preserve">The service runs planner.py reminders every 30 seconds. The Python backend decides whether a notification is due and deduplicates notifications in SQLite. The QML service does not duplicate the reminder logic.</w:t>
+        <w:t xml:space="preserve">The service runs planner.py reminders every 30 seconds. The Python backend decides whether an agenda notification or the four-hour Kanban check is due and deduplicates notifications in SQLite/settings. The QML service does not duplicate the reminder logic.</w:t>
       </w:r>
     </w:p>
     <w:p>
@@ -497,7 +497,7 @@
         <w:tc>
           <w:p>
             <w:r>
-              <w:t xml:space="preserve">Calculate lead/start/missed reminders and write notification keys to prevent repeats.</w:t>
+              <w:t xml:space="preserve">Calculate lead/start/missed agenda reminders and four-hour Kanban checks, writing state to prevent repeats.</w:t>
             </w:r>
           </w:p>
         </w:tc>
@@ -888,7 +888,7 @@
         <w:pStyle w:val="Normal"/>
       </w:pPr>
       <w:r>
-        <w:t xml:space="preserve">Default settings are a 10-minute lead reminder and a reminder at block start. Missed-block reminders are disabled by default. Settings can be viewed or changed with:</w:t>
+        <w:t xml:space="preserve">Default settings are a 10-minute lead reminder, a reminder at block start, and a Kanban-board reminder every 4 hours. Missed-block reminders are disabled by default. Agenda and Kanban notifications play the standard Freedesktop sound /usr/share/sounds/freedesktop/stereo/message-new-instant.oga when available. Settings can be viewed or changed with:</w:t>
       </w:r>
     </w:p>
     <w:p>
@@ -899,7 +899,16 @@
         <w:t xml:space="preserve">python3 planner.py settings
 python3 planner.py settings lead_minutes 15
 python3 planner.py settings notify_at_start 0
-python3 planner.py settings notify_missed 1</w:t>
+python3 planner.py settings notify_missed 1
+python3 planner.py settings kanban_reminder_hours 4</w:t>
+      </w:r>
+    </w:p>
+    <w:p>
+      <w:pPr>
+        <w:pStyle w:val="Normal"/>
+      </w:pPr>
+      <w:r>
+        <w:t xml:space="preserve">Set STUDY_PLANNER_SOUND_FILE to use another local audio file, or set STUDY_PLANNER_NO_SOUND=1 to disable sound playback.</w:t>
       </w:r>
     </w:p>
     <w:p>

</xml_diff>